<commit_message>
Atualiza o documento DVP.docx com novas informações
</commit_message>
<xml_diff>
--- a/DVP.docx
+++ b/DVP.docx
@@ -1107,6 +1107,14 @@
                 <w:szCs w:val="18"/>
               </w:rPr>
             </w:pPr>
+            <w:r>
+              <w:rPr>
+                <w:rFonts w:ascii="Arial" w:eastAsia="Arial" w:hAnsi="Arial" w:cs="Arial"/>
+                <w:sz w:val="18"/>
+                <w:szCs w:val="18"/>
+              </w:rPr>
+              <w:t>3.0</w:t>
+            </w:r>
           </w:p>
         </w:tc>
         <w:tc>
@@ -1133,6 +1141,14 @@
                 <w:szCs w:val="18"/>
               </w:rPr>
             </w:pPr>
+            <w:r>
+              <w:rPr>
+                <w:rFonts w:ascii="Arial" w:eastAsia="Arial" w:hAnsi="Arial" w:cs="Arial"/>
+                <w:sz w:val="18"/>
+                <w:szCs w:val="18"/>
+              </w:rPr>
+              <w:t>Implementação concluída. Features extras adicionadas.</w:t>
+            </w:r>
           </w:p>
         </w:tc>
         <w:tc>
@@ -1160,6 +1176,14 @@
                 <w:szCs w:val="18"/>
               </w:rPr>
             </w:pPr>
+            <w:r>
+              <w:rPr>
+                <w:rFonts w:ascii="Arial" w:eastAsia="Arial" w:hAnsi="Arial" w:cs="Arial"/>
+                <w:sz w:val="18"/>
+                <w:szCs w:val="18"/>
+              </w:rPr>
+              <w:t>Andre S.</w:t>
+            </w:r>
           </w:p>
         </w:tc>
         <w:tc>
@@ -1187,6 +1211,14 @@
                 <w:szCs w:val="18"/>
               </w:rPr>
             </w:pPr>
+            <w:r>
+              <w:rPr>
+                <w:rFonts w:ascii="Arial" w:eastAsia="Arial" w:hAnsi="Arial" w:cs="Arial"/>
+                <w:sz w:val="18"/>
+                <w:szCs w:val="18"/>
+              </w:rPr>
+              <w:t>02/11</w:t>
+            </w:r>
           </w:p>
         </w:tc>
       </w:tr>
@@ -1485,6 +1517,7 @@
           <w:docPartUnique/>
         </w:docPartObj>
       </w:sdtPr>
+      <w:sdtEndPr/>
       <w:sdtContent>
         <w:p>
           <w:pPr>
@@ -17470,28 +17503,28 @@
 </file>
 
 <file path=customXml/item1.xml><?xml version="1.0" encoding="utf-8"?>
-<b:Sources xmlns:b="http://schemas.openxmlformats.org/officeDocument/2006/bibliography" xmlns="http://schemas.openxmlformats.org/officeDocument/2006/bibliography" SelectedStyle="\ABNT_Author.XSL" StyleName="ABNT NBR 6023:2002*" Version="1"/>
-</file>
-
-<file path=customXml/item2.xml><?xml version="1.0" encoding="utf-8"?>
 <go:gDocsCustomXmlDataStorage xmlns:go="http://customooxmlschemas.google.com/" xmlns:r="http://schemas.openxmlformats.org/officeDocument/2006/relationships">
   <go:docsCustomData xmlns:go="http://customooxmlschemas.google.com/" roundtripDataSignature="AMtx7miainSTuZdTTVH9gMj+hmNxCV71aQ==">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</go:docsCustomData>
 </go:gDocsCustomXmlDataStorage>
 </file>
 
-<file path=customXml/itemProps1.xml><?xml version="1.0" encoding="utf-8"?>
-<ds:datastoreItem xmlns:ds="http://schemas.openxmlformats.org/officeDocument/2006/customXml" ds:itemID="{7FDBFAFA-3EB7-4E40-9B19-BD3FBDE65242}">
-  <ds:schemaRefs>
-    <ds:schemaRef ds:uri="http://schemas.openxmlformats.org/officeDocument/2006/bibliography"/>
-  </ds:schemaRefs>
-</ds:datastoreItem>
+<file path=customXml/item2.xml><?xml version="1.0" encoding="utf-8"?>
+<b:Sources xmlns:b="http://schemas.openxmlformats.org/officeDocument/2006/bibliography" xmlns="http://schemas.openxmlformats.org/officeDocument/2006/bibliography" SelectedStyle="\ABNT_Author.XSL" StyleName="ABNT NBR 6023:2002*" Version="1"/>
 </file>
 
-<file path=customXml/itemProps2.xml><?xml version="1.0" encoding="utf-8"?>
+<file path=customXml/itemProps1.xml><?xml version="1.0" encoding="utf-8"?>
 <ds:datastoreItem xmlns:ds="http://schemas.openxmlformats.org/officeDocument/2006/customXml" ds:itemID="{11111111-1234-1234-1234-123412341234}">
   <ds:schemaRefs>
     <ds:schemaRef ds:uri="http://customooxmlschemas.google.com/"/>
     <ds:schemaRef ds:uri="http://schemas.openxmlformats.org/officeDocument/2006/relationships"/>
   </ds:schemaRefs>
 </ds:datastoreItem>
+</file>
+
+<file path=customXml/itemProps2.xml><?xml version="1.0" encoding="utf-8"?>
+<ds:datastoreItem xmlns:ds="http://schemas.openxmlformats.org/officeDocument/2006/customXml" ds:itemID="{7FDBFAFA-3EB7-4E40-9B19-BD3FBDE65242}">
+  <ds:schemaRefs>
+    <ds:schemaRef ds:uri="http://schemas.openxmlformats.org/officeDocument/2006/bibliography"/>
+  </ds:schemaRefs>
+</ds:datastoreItem>
 </file>
</xml_diff>